<commit_message>
Remove page footer from PDF and Word files; drop docx build script
Co-Authored-By: Claude Opus 5.5 <noreply@anthropic.com>
Claude-Session: https://claude.ai/code/session_01UD81TYexXfwpxDLmac694z
</commit_message>
<xml_diff>
--- a/Waleed_Ahmad_FA23-BBD-151_Lab_9_10.docx
+++ b/Waleed_Ahmad_FA23-BBD-151_Lab_9_10.docx
@@ -30,7 +30,7 @@
                     </pic:cNvPicPr>
                   </pic:nvPicPr>
                   <pic:blipFill>
-                    <a:blip r:embed="rId9" cstate="none"/>
+                    <a:blip r:embed="rId7" cstate="none"/>
                     <a:srcRect/>
                     <a:stretch>
                       <a:fillRect/>
@@ -3431,7 +3431,7 @@
                     </pic:cNvPicPr>
                   </pic:nvPicPr>
                   <pic:blipFill>
-                    <a:blip r:embed="rId10" cstate="none"/>
+                    <a:blip r:embed="rId8" cstate="none"/>
                     <a:srcRect/>
                     <a:stretch>
                       <a:fillRect/>
@@ -5304,7 +5304,7 @@
                     </pic:cNvPicPr>
                   </pic:nvPicPr>
                   <pic:blipFill>
-                    <a:blip r:embed="rId11" cstate="none"/>
+                    <a:blip r:embed="rId9" cstate="none"/>
                     <a:srcRect/>
                     <a:stretch>
                       <a:fillRect/>
@@ -10316,7 +10316,7 @@
                     </pic:cNvPicPr>
                   </pic:nvPicPr>
                   <pic:blipFill>
-                    <a:blip r:embed="rId12" cstate="none"/>
+                    <a:blip r:embed="rId10" cstate="none"/>
                     <a:srcRect/>
                     <a:stretch>
                       <a:fillRect/>
@@ -11803,7 +11803,7 @@
                     </pic:cNvPicPr>
                   </pic:nvPicPr>
                   <pic:blipFill>
-                    <a:blip r:embed="rId13" cstate="none"/>
+                    <a:blip r:embed="rId11" cstate="none"/>
                     <a:srcRect/>
                     <a:stretch>
                       <a:fillRect/>
@@ -16588,7 +16588,7 @@
                     </pic:cNvPicPr>
                   </pic:nvPicPr>
                   <pic:blipFill>
-                    <a:blip r:embed="rId14" cstate="none"/>
+                    <a:blip r:embed="rId12" cstate="none"/>
                     <a:srcRect/>
                     <a:stretch>
                       <a:fillRect/>
@@ -16928,7 +16928,7 @@
                     </pic:cNvPicPr>
                   </pic:nvPicPr>
                   <pic:blipFill>
-                    <a:blip r:embed="rId15" cstate="none"/>
+                    <a:blip r:embed="rId13" cstate="none"/>
                     <a:srcRect/>
                     <a:stretch>
                       <a:fillRect/>
@@ -16974,7 +16974,7 @@
                     </pic:cNvPicPr>
                   </pic:nvPicPr>
                   <pic:blipFill>
-                    <a:blip r:embed="rId16" cstate="none"/>
+                    <a:blip r:embed="rId14" cstate="none"/>
                     <a:srcRect/>
                     <a:stretch>
                       <a:fillRect/>
@@ -18050,7 +18050,7 @@
                     </pic:cNvPicPr>
                   </pic:nvPicPr>
                   <pic:blipFill>
-                    <a:blip r:embed="rId17" cstate="none"/>
+                    <a:blip r:embed="rId15" cstate="none"/>
                     <a:srcRect/>
                     <a:stretch>
                       <a:fillRect/>
@@ -18096,7 +18096,7 @@
                     </pic:cNvPicPr>
                   </pic:nvPicPr>
                   <pic:blipFill>
-                    <a:blip r:embed="rId18" cstate="none"/>
+                    <a:blip r:embed="rId16" cstate="none"/>
                     <a:srcRect/>
                     <a:stretch>
                       <a:fillRect/>
@@ -18142,7 +18142,7 @@
                     </pic:cNvPicPr>
                   </pic:nvPicPr>
                   <pic:blipFill>
-                    <a:blip r:embed="rId19" cstate="none"/>
+                    <a:blip r:embed="rId17" cstate="none"/>
                     <a:srcRect/>
                     <a:stretch>
                       <a:fillRect/>
@@ -20324,7 +20324,7 @@
                     </pic:cNvPicPr>
                   </pic:nvPicPr>
                   <pic:blipFill>
-                    <a:blip r:embed="rId20" cstate="none"/>
+                    <a:blip r:embed="rId18" cstate="none"/>
                     <a:srcRect/>
                     <a:stretch>
                       <a:fillRect/>
@@ -20370,7 +20370,7 @@
                     </pic:cNvPicPr>
                   </pic:nvPicPr>
                   <pic:blipFill>
-                    <a:blip r:embed="rId21" cstate="none"/>
+                    <a:blip r:embed="rId19" cstate="none"/>
                     <a:srcRect/>
                     <a:stretch>
                       <a:fillRect/>
@@ -20416,7 +20416,7 @@
                     </pic:cNvPicPr>
                   </pic:nvPicPr>
                   <pic:blipFill>
-                    <a:blip r:embed="rId22" cstate="none"/>
+                    <a:blip r:embed="rId20" cstate="none"/>
                     <a:srcRect/>
                     <a:stretch>
                       <a:fillRect/>
@@ -20462,7 +20462,7 @@
                     </pic:cNvPicPr>
                   </pic:nvPicPr>
                   <pic:blipFill>
-                    <a:blip r:embed="rId23" cstate="none"/>
+                    <a:blip r:embed="rId21" cstate="none"/>
                     <a:srcRect/>
                     <a:stretch>
                       <a:fillRect/>
@@ -21050,7 +21050,7 @@
                     </pic:cNvPicPr>
                   </pic:nvPicPr>
                   <pic:blipFill>
-                    <a:blip r:embed="rId24" cstate="none"/>
+                    <a:blip r:embed="rId22" cstate="none"/>
                     <a:srcRect/>
                     <a:stretch>
                       <a:fillRect/>
@@ -24445,7 +24445,7 @@
                     </pic:cNvPicPr>
                   </pic:nvPicPr>
                   <pic:blipFill>
-                    <a:blip r:embed="rId25" cstate="none"/>
+                    <a:blip r:embed="rId23" cstate="none"/>
                     <a:srcRect/>
                     <a:stretch>
                       <a:fillRect/>
@@ -25045,7 +25045,7 @@
                     </pic:cNvPicPr>
                   </pic:nvPicPr>
                   <pic:blipFill>
-                    <a:blip r:embed="rId26" cstate="none"/>
+                    <a:blip r:embed="rId24" cstate="none"/>
                     <a:srcRect/>
                     <a:stretch>
                       <a:fillRect/>
@@ -25541,7 +25541,7 @@
                     </pic:cNvPicPr>
                   </pic:nvPicPr>
                   <pic:blipFill>
-                    <a:blip r:embed="rId27" cstate="none"/>
+                    <a:blip r:embed="rId25" cstate="none"/>
                     <a:srcRect/>
                     <a:stretch>
                       <a:fillRect/>
@@ -25587,7 +25587,7 @@
                     </pic:cNvPicPr>
                   </pic:nvPicPr>
                   <pic:blipFill>
-                    <a:blip r:embed="rId28" cstate="none"/>
+                    <a:blip r:embed="rId26" cstate="none"/>
                     <a:srcRect/>
                     <a:stretch>
                       <a:fillRect/>
@@ -25633,7 +25633,7 @@
                     </pic:cNvPicPr>
                   </pic:nvPicPr>
                   <pic:blipFill>
-                    <a:blip r:embed="rId29" cstate="none"/>
+                    <a:blip r:embed="rId27" cstate="none"/>
                     <a:srcRect/>
                     <a:stretch>
                       <a:fillRect/>
@@ -25679,7 +25679,7 @@
                     </pic:cNvPicPr>
                   </pic:nvPicPr>
                   <pic:blipFill>
-                    <a:blip r:embed="rId30" cstate="none"/>
+                    <a:blip r:embed="rId28" cstate="none"/>
                     <a:srcRect/>
                     <a:stretch>
                       <a:fillRect/>
@@ -26267,7 +26267,7 @@
                     </pic:cNvPicPr>
                   </pic:nvPicPr>
                   <pic:blipFill>
-                    <a:blip r:embed="rId31" cstate="none"/>
+                    <a:blip r:embed="rId29" cstate="none"/>
                     <a:srcRect/>
                     <a:stretch>
                       <a:fillRect/>
@@ -26313,7 +26313,7 @@
                     </pic:cNvPicPr>
                   </pic:nvPicPr>
                   <pic:blipFill>
-                    <a:blip r:embed="rId32" cstate="none"/>
+                    <a:blip r:embed="rId30" cstate="none"/>
                     <a:srcRect/>
                     <a:stretch>
                       <a:fillRect/>
@@ -26405,12 +26405,9 @@
       </w:r>
     </w:p>
     <w:sectPr>
-      <w:footerReference w:type="default" r:id="rId7"/>
-      <w:footerReference w:type="first" r:id="rId8"/>
       <w:pgSz w:w="11906" w:h="16838" w:orient="portrait"/>
       <w:pgMar w:top="1020" w:right="1020" w:bottom="1020" w:left="1020" w:header="708" w:footer="708" w:gutter="0"/>
       <w:pgNumType/>
-      <w:titlePg/>
       <w:docGrid w:linePitch="360"/>
     </w:sectPr>
   </w:body>
@@ -26456,54 +26453,6 @@
     </w:p>
   </w:endnote>
 </w:endnotes>
-</file>
-
-<file path=word/footer1.xml><?xml version="1.0" encoding="utf-8"?>
-<w:ftr xmlns:wpc="http://schemas.microsoft.com/office/word/2010/wordprocessingCanvas" xmlns:mc="http://schemas.openxmlformats.org/markup-compatibility/2006" xmlns:o="urn:schemas-microsoft-com:office:office" xmlns:r="http://schemas.openxmlformats.org/officeDocument/2006/relationships" xmlns:m="http://schemas.openxmlformats.org/officeDocument/2006/math" xmlns:v="urn:schemas-microsoft-com:vml" xmlns:wp14="http://schemas.microsoft.com/office/word/2010/wordprocessingDrawing" xmlns:wp="http://schemas.openxmlformats.org/drawingml/2006/wordprocessingDrawing" xmlns:w10="urn:schemas-microsoft-com:office:word" xmlns:w="http://schemas.openxmlformats.org/wordprocessingml/2006/main" xmlns:w14="http://schemas.microsoft.com/office/word/2010/wordml" xmlns:w15="http://schemas.microsoft.com/office/word/2012/wordml" xmlns:wpg="http://schemas.microsoft.com/office/word/2010/wordprocessingGroup" xmlns:wpi="http://schemas.microsoft.com/office/word/2010/wordprocessingInk" xmlns:wne="http://schemas.microsoft.com/office/word/2006/wordml" xmlns:wps="http://schemas.microsoft.com/office/word/2010/wordprocessingShape">
-  <w:p>
-    <w:pPr>
-      <w:tabs>
-        <w:tab w:val="right" w:pos="9866"/>
-      </w:tabs>
-    </w:pPr>
-    <w:r>
-      <w:rPr>
-        <w:rFonts w:ascii="Arial" w:cs="Arial" w:eastAsia="Arial" w:hAnsi="Arial"/>
-        <w:color w:val="777777"/>
-        <w:sz w:val="16"/>
-        <w:szCs w:val="16"/>
-      </w:rPr>
-      <w:t xml:space="preserve">Waleed Ahmad  |  FA23-BBD-151  |  Lab Assignment 9, 10</w:t>
-    </w:r>
-    <w:r>
-      <w:rPr>
-        <w:rFonts w:ascii="Arial" w:cs="Arial" w:eastAsia="Arial" w:hAnsi="Arial"/>
-        <w:color w:val="777777"/>
-        <w:sz w:val="16"/>
-        <w:szCs w:val="16"/>
-      </w:rPr>
-      <w:t xml:space="preserve">	Page </w:t>
-    </w:r>
-    <w:r>
-      <w:rPr>
-        <w:rFonts w:ascii="Arial" w:cs="Arial" w:eastAsia="Arial" w:hAnsi="Arial"/>
-        <w:color w:val="777777"/>
-        <w:sz w:val="16"/>
-        <w:szCs w:val="16"/>
-      </w:rPr>
-      <w:fldChar w:fldCharType="begin"/>
-      <w:instrText xml:space="preserve">PAGE</w:instrText>
-      <w:fldChar w:fldCharType="separate"/>
-      <w:fldChar w:fldCharType="end"/>
-    </w:r>
-  </w:p>
-</w:ftr>
-</file>
-
-<file path=word/footer2.xml><?xml version="1.0" encoding="utf-8"?>
-<w:ftr xmlns:wpc="http://schemas.microsoft.com/office/word/2010/wordprocessingCanvas" xmlns:mc="http://schemas.openxmlformats.org/markup-compatibility/2006" xmlns:o="urn:schemas-microsoft-com:office:office" xmlns:r="http://schemas.openxmlformats.org/officeDocument/2006/relationships" xmlns:m="http://schemas.openxmlformats.org/officeDocument/2006/math" xmlns:v="urn:schemas-microsoft-com:vml" xmlns:wp14="http://schemas.microsoft.com/office/word/2010/wordprocessingDrawing" xmlns:wp="http://schemas.openxmlformats.org/drawingml/2006/wordprocessingDrawing" xmlns:w10="urn:schemas-microsoft-com:office:word" xmlns:w="http://schemas.openxmlformats.org/wordprocessingml/2006/main" xmlns:w14="http://schemas.microsoft.com/office/word/2010/wordml" xmlns:w15="http://schemas.microsoft.com/office/word/2012/wordml" xmlns:wpg="http://schemas.microsoft.com/office/word/2010/wordprocessingGroup" xmlns:wpi="http://schemas.microsoft.com/office/word/2010/wordprocessingInk" xmlns:wne="http://schemas.microsoft.com/office/word/2006/wordml" xmlns:wps="http://schemas.microsoft.com/office/word/2010/wordprocessingShape">
-  <w:p/>
-</w:ftr>
 </file>
 
 <file path=word/footnotes.xml><?xml version="1.0" encoding="utf-8"?>

</xml_diff>